<commit_message>
Finalize Project 1 paper, presentation and reproducibility package
</commit_message>
<xml_diff>
--- a/paper/MMF1941_Project1_Final_Paper.docx
+++ b/paper/MMF1941_Project1_Final_Paper.docx
@@ -10,7 +10,7 @@
         <w:t xml:space="preserve">MMF1941_Project1_Final_Paper</w:t>
       </w:r>
     </w:p>
-    <w:bookmarkStart w:id="36" w:name="X26377c3e992082830397fcc821252991d06e2e4"/>
+    <w:bookmarkStart w:id="51" w:name="X26377c3e992082830397fcc821252991d06e2e4"/>
     <w:p>
       <w:pPr>
         <w:pStyle w:val="Heading1"/>
@@ -530,7 +530,7 @@
       </w:r>
     </w:p>
     <w:bookmarkEnd w:id="10"/>
-    <w:bookmarkStart w:id="12" w:name="data-and-sample-construction"/>
+    <w:bookmarkStart w:id="15" w:name="data-and-sample-construction"/>
     <w:p>
       <w:pPr>
         <w:pStyle w:val="Heading2"/>
@@ -986,7 +986,7 @@
         <w:t xml:space="preserve">representative performance over all intended asset-days.</w:t>
       </w:r>
     </w:p>
-    <w:bookmarkStart w:id="11" w:name="X712d8720b3af4d6426d55d4a0a2645665b9eb36"/>
+    <w:bookmarkStart w:id="14" w:name="X712d8720b3af4d6426d55d4a0a2645665b9eb36"/>
     <w:p>
       <w:pPr>
         <w:pStyle w:val="Heading3"/>
@@ -1011,64 +1011,50 @@
     </w:p>
     <w:p>
       <w:pPr>
-        <w:sectPr>
-          <w:type w:val="nextPage"/>
-          <w:pgSz w:w="12240" w:h="15840"/>
-          <w:pgMar w:top="1008" w:bottom="1008" w:left="1008" w:right="1008" w:header="360" w:footer="360" w:gutter="0"/>
-        </w:sectPr>
+        <w:pStyle w:val="CaptionedFigure"/>
       </w:pPr>
-    </w:p>
-    <w:tbl>
-      <w:tblPr>
-        <w:tblStyle w:val="FigureTable"/>
-        <w:tblW w:type="auto" w:w="0"/>
-        <w:jc w:val="center"/>
-        <w:tblLayout w:type="fixed"/>
-        <w:tblLook w:firstRow="0" w:lastRow="0" w:firstColumn="0" w:lastColumn="0"/>
-        <w:tblBorders>
-          <w:top w:val="single" w:sz="4" w:color="B0B0B0"/>
-          <w:left w:val="single" w:sz="4" w:color="B0B0B0"/>
-          <w:bottom w:val="single" w:sz="4" w:color="B0B0B0"/>
-          <w:right w:val="single" w:sz="4" w:color="B0B0B0"/>
-          <w:insideH w:val="single" w:sz="4" w:color="B0B0B0"/>
-          <w:insideV w:val="single" w:sz="4" w:color="B0B0B0"/>
-        </w:tblBorders>
-      </w:tblPr>
-      <w:tblGrid>
-        <w:gridCol w:w="13824"/>
-      </w:tblGrid>
-      <w:tr>
-        <w:trPr>
-          <w:tblHeader/>
-        </w:trPr>
-        <w:tc>
-          <w:tcPr>
-            <w:tcW w:type="dxa" w:w="13824"/>
-          </w:tcPr>
-          <w:p>
-            <w:pPr>
-              <w:pStyle w:val="Compact"/>
-              <w:spacing w:after="60"/>
-              <w:jc w:val="center"/>
-            </w:pPr>
-            <w:r>
-              <w:rPr>
-                <w:sz w:val="18"/>
-              </w:rPr>
-              <w:t xml:space="preserve">Figure 4. Roll undefinedness and pair-coverage sensitivities. The right panel is robustness evidence, not the primary sample.</w:t>
-            </w:r>
-          </w:p>
-        </w:tc>
-      </w:tr>
-    </w:tbl>
-    <w:p>
-      <w:pPr>
-        <w:sectPr>
-          <w:type w:val="nextPage"/>
-          <w:pgSz w:w="15840" w:h="12240" w:orient="landscape"/>
-          <w:pgMar w:top="1008" w:bottom="1008" w:left="1008" w:right="1008" w:header="360" w:footer="360" w:gutter="0"/>
-        </w:sectPr>
-      </w:pPr>
+      <w:r>
+        <w:drawing>
+          <wp:inline>
+            <wp:extent cx="6400800" cy="2839804"/>
+            <wp:effectExtent b="0" l="0" r="0" t="0"/>
+            <wp:docPr descr="Figure 4. Roll undefinedness and pair-coverage sensitivities. The right panel is robustness evidence, not the primary sample." title="" id="12" name="Picture"/>
+            <a:graphic>
+              <a:graphicData uri="http://schemas.openxmlformats.org/drawingml/2006/picture">
+                <pic:pic>
+                  <pic:nvPicPr>
+                    <pic:cNvPr descr="figure4_benchmark_coverage.png" id="13" name="Picture"/>
+                    <pic:cNvPicPr>
+                      <a:picLocks noChangeArrowheads="1" noChangeAspect="1"/>
+                    </pic:cNvPicPr>
+                  </pic:nvPicPr>
+                  <pic:blipFill>
+                    <a:blip r:embed="rId11"/>
+                    <a:stretch>
+                      <a:fillRect/>
+                    </a:stretch>
+                  </pic:blipFill>
+                  <pic:spPr bwMode="auto">
+                    <a:xfrm>
+                      <a:off x="0" y="0"/>
+                      <a:ext cx="6400800" cy="2839804"/>
+                    </a:xfrm>
+                    <a:prstGeom prst="rect">
+                      <a:avLst/>
+                    </a:prstGeom>
+                    <a:noFill/>
+                    <a:ln w="9525">
+                      <a:noFill/>
+                      <a:headEnd/>
+                      <a:tailEnd/>
+                    </a:ln>
+                  </pic:spPr>
+                </pic:pic>
+              </a:graphicData>
+            </a:graphic>
+          </wp:inline>
+        </w:drawing>
+      </w:r>
     </w:p>
     <w:p>
       <w:pPr>
@@ -1090,9 +1076,9 @@
         <w:t xml:space="preserve">the primary sample.</w:t>
       </w:r>
     </w:p>
-    <w:bookmarkEnd w:id="11"/>
-    <w:bookmarkEnd w:id="12"/>
-    <w:bookmarkStart w:id="14" w:name="methodology"/>
+    <w:bookmarkEnd w:id="14"/>
+    <w:bookmarkEnd w:id="15"/>
+    <w:bookmarkStart w:id="17" w:name="methodology"/>
     <w:p>
       <w:pPr>
         <w:pStyle w:val="Heading2"/>
@@ -1606,7 +1592,7 @@
         <w:t xml:space="preserve">multiplicity-adjusted or comprehensive panel-dependence analysis.</w:t>
       </w:r>
     </w:p>
-    <w:bookmarkStart w:id="13" w:name="X96fffc86f7f079a95306d7ece3f8e33af488982"/>
+    <w:bookmarkStart w:id="16" w:name="X96fffc86f7f079a95306d7ece3f8e33af488982"/>
     <w:p>
       <w:pPr>
         <w:pStyle w:val="Heading3"/>
@@ -6642,9 +6628,9 @@
         <w:t xml:space="preserve">importance.</w:t>
       </w:r>
     </w:p>
-    <w:bookmarkEnd w:id="13"/>
-    <w:bookmarkEnd w:id="14"/>
-    <w:bookmarkStart w:id="20" w:name="primary-results"/>
+    <w:bookmarkEnd w:id="16"/>
+    <w:bookmarkEnd w:id="17"/>
+    <w:bookmarkStart w:id="32" w:name="primary-results"/>
     <w:p>
       <w:pPr>
         <w:pStyle w:val="Heading2"/>
@@ -6772,7 +6758,7 @@
         <w:t xml:space="preserve">the comparison.</w:t>
       </w:r>
     </w:p>
-    <w:bookmarkStart w:id="15" w:name="Xf84c02c4eafe7ad0cc1e2c547c600948688c2bb"/>
+    <w:bookmarkStart w:id="21" w:name="Xf84c02c4eafe7ad0cc1e2c547c600948688c2bb"/>
     <w:p>
       <w:pPr>
         <w:pStyle w:val="Heading3"/>
@@ -6797,64 +6783,50 @@
     </w:p>
     <w:p>
       <w:pPr>
-        <w:sectPr>
-          <w:type w:val="nextPage"/>
-          <w:pgSz w:w="12240" w:h="15840"/>
-          <w:pgMar w:top="1008" w:bottom="1008" w:left="1008" w:right="1008" w:header="360" w:footer="360" w:gutter="0"/>
-        </w:sectPr>
+        <w:pStyle w:val="CaptionedFigure"/>
       </w:pPr>
-    </w:p>
-    <w:tbl>
-      <w:tblPr>
-        <w:tblStyle w:val="FigureTable"/>
-        <w:tblW w:type="auto" w:w="0"/>
-        <w:jc w:val="center"/>
-        <w:tblLayout w:type="fixed"/>
-        <w:tblLook w:firstRow="0" w:lastRow="0" w:firstColumn="0" w:lastColumn="0"/>
-        <w:tblBorders>
-          <w:top w:val="single" w:sz="4" w:color="B0B0B0"/>
-          <w:left w:val="single" w:sz="4" w:color="B0B0B0"/>
-          <w:bottom w:val="single" w:sz="4" w:color="B0B0B0"/>
-          <w:right w:val="single" w:sz="4" w:color="B0B0B0"/>
-          <w:insideH w:val="single" w:sz="4" w:color="B0B0B0"/>
-          <w:insideV w:val="single" w:sz="4" w:color="B0B0B0"/>
-        </w:tblBorders>
-      </w:tblPr>
-      <w:tblGrid>
-        <w:gridCol w:w="13824"/>
-      </w:tblGrid>
-      <w:tr>
-        <w:trPr>
-          <w:tblHeader/>
-        </w:trPr>
-        <w:tc>
-          <w:tcPr>
-            <w:tcW w:type="dxa" w:w="13824"/>
-          </w:tcPr>
-          <w:p>
-            <w:pPr>
-              <w:pStyle w:val="Compact"/>
-              <w:spacing w:after="60"/>
-              <w:jc w:val="center"/>
-            </w:pPr>
-            <w:r>
-              <w:rPr>
-                <w:sz w:val="18"/>
-              </w:rPr>
-              <w:t xml:space="preserve">Figure 2. Signed-error distributions; full-range ECDF, basis points. The zero-error reference is retained.</w:t>
-            </w:r>
-          </w:p>
-        </w:tc>
-      </w:tr>
-    </w:tbl>
-    <w:p>
-      <w:pPr>
-        <w:sectPr>
-          <w:type w:val="nextPage"/>
-          <w:pgSz w:w="15840" w:h="12240" w:orient="landscape"/>
-          <w:pgMar w:top="1008" w:bottom="1008" w:left="1008" w:right="1008" w:header="360" w:footer="360" w:gutter="0"/>
-        </w:sectPr>
-      </w:pPr>
+      <w:r>
+        <w:drawing>
+          <wp:inline>
+            <wp:extent cx="6400800" cy="3902794"/>
+            <wp:effectExtent b="0" l="0" r="0" t="0"/>
+            <wp:docPr descr="Figure 2. Signed-error distributions; full-range ECDF, basis points. The zero-error reference is retained." title="" id="19" name="Picture"/>
+            <a:graphic>
+              <a:graphicData uri="http://schemas.openxmlformats.org/drawingml/2006/picture">
+                <pic:pic>
+                  <pic:nvPicPr>
+                    <pic:cNvPr descr="figure2_error_distribution.png" id="20" name="Picture"/>
+                    <pic:cNvPicPr>
+                      <a:picLocks noChangeArrowheads="1" noChangeAspect="1"/>
+                    </pic:cNvPicPr>
+                  </pic:nvPicPr>
+                  <pic:blipFill>
+                    <a:blip r:embed="rId18"/>
+                    <a:stretch>
+                      <a:fillRect/>
+                    </a:stretch>
+                  </pic:blipFill>
+                  <pic:spPr bwMode="auto">
+                    <a:xfrm>
+                      <a:off x="0" y="0"/>
+                      <a:ext cx="6400800" cy="3902794"/>
+                    </a:xfrm>
+                    <a:prstGeom prst="rect">
+                      <a:avLst/>
+                    </a:prstGeom>
+                    <a:noFill/>
+                    <a:ln w="9525">
+                      <a:noFill/>
+                      <a:headEnd/>
+                      <a:tailEnd/>
+                    </a:ln>
+                  </pic:spPr>
+                </pic:pic>
+              </a:graphicData>
+            </a:graphic>
+          </wp:inline>
+        </w:drawing>
+      </w:r>
     </w:p>
     <w:p>
       <w:pPr>
@@ -6876,8 +6848,8 @@
         <w:t xml:space="preserve">retained.</w:t>
       </w:r>
     </w:p>
-    <w:bookmarkEnd w:id="15"/>
-    <w:bookmarkStart w:id="16" w:name="X65fb6957de673a6dc3a3985c8071f5052b9e06c"/>
+    <w:bookmarkEnd w:id="21"/>
+    <w:bookmarkStart w:id="25" w:name="X65fb6957de673a6dc3a3985c8071f5052b9e06c"/>
     <w:p>
       <w:pPr>
         <w:pStyle w:val="Heading3"/>
@@ -6902,64 +6874,50 @@
     </w:p>
     <w:p>
       <w:pPr>
-        <w:sectPr>
-          <w:type w:val="nextPage"/>
-          <w:pgSz w:w="12240" w:h="15840"/>
-          <w:pgMar w:top="1008" w:bottom="1008" w:left="1008" w:right="1008" w:header="360" w:footer="360" w:gutter="0"/>
-        </w:sectPr>
+        <w:pStyle w:val="CaptionedFigure"/>
       </w:pPr>
-    </w:p>
-    <w:tbl>
-      <w:tblPr>
-        <w:tblStyle w:val="FigureTable"/>
-        <w:tblW w:type="auto" w:w="0"/>
-        <w:jc w:val="center"/>
-        <w:tblLayout w:type="fixed"/>
-        <w:tblLook w:firstRow="0" w:lastRow="0" w:firstColumn="0" w:lastColumn="0"/>
-        <w:tblBorders>
-          <w:top w:val="single" w:sz="4" w:color="B0B0B0"/>
-          <w:left w:val="single" w:sz="4" w:color="B0B0B0"/>
-          <w:bottom w:val="single" w:sz="4" w:color="B0B0B0"/>
-          <w:right w:val="single" w:sz="4" w:color="B0B0B0"/>
-          <w:insideH w:val="single" w:sz="4" w:color="B0B0B0"/>
-          <w:insideV w:val="single" w:sz="4" w:color="B0B0B0"/>
-        </w:tblBorders>
-      </w:tblPr>
-      <w:tblGrid>
-        <w:gridCol w:w="13824"/>
-      </w:tblGrid>
-      <w:tr>
-        <w:trPr>
-          <w:tblHeader/>
-        </w:trPr>
-        <w:tc>
-          <w:tcPr>
-            <w:tcW w:type="dxa" w:w="13824"/>
-          </w:tcPr>
-          <w:p>
-            <w:pPr>
-              <w:pStyle w:val="Compact"/>
-              <w:spacing w:after="60"/>
-              <w:jc w:val="center"/>
-            </w:pPr>
-            <w:r>
-              <w:rPr>
-                <w:sz w:val="18"/>
-              </w:rPr>
-              <w:t xml:space="preserve">Figure 1. Estimator versus Roll; full common-defined sample, basis points. Both axes use the labeled asinh display; no observations clipped.</w:t>
-            </w:r>
-          </w:p>
-        </w:tc>
-      </w:tr>
-    </w:tbl>
-    <w:p>
-      <w:pPr>
-        <w:sectPr>
-          <w:type w:val="nextPage"/>
-          <w:pgSz w:w="15840" w:h="12240" w:orient="landscape"/>
-          <w:pgMar w:top="1008" w:bottom="1008" w:left="1008" w:right="1008" w:header="360" w:footer="360" w:gutter="0"/>
-        </w:sectPr>
-      </w:pPr>
+      <w:r>
+        <w:drawing>
+          <wp:inline>
+            <wp:extent cx="6400800" cy="2727279"/>
+            <wp:effectExtent b="0" l="0" r="0" t="0"/>
+            <wp:docPr descr="Figure 1. Estimator versus Roll; full common-defined sample, basis points. Both axes use the labeled asinh display; no observations clipped." title="" id="23" name="Picture"/>
+            <a:graphic>
+              <a:graphicData uri="http://schemas.openxmlformats.org/drawingml/2006/picture">
+                <pic:pic>
+                  <pic:nvPicPr>
+                    <pic:cNvPr descr="figure1_estimator_vs_roll.png" id="24" name="Picture"/>
+                    <pic:cNvPicPr>
+                      <a:picLocks noChangeArrowheads="1" noChangeAspect="1"/>
+                    </pic:cNvPicPr>
+                  </pic:nvPicPr>
+                  <pic:blipFill>
+                    <a:blip r:embed="rId22"/>
+                    <a:stretch>
+                      <a:fillRect/>
+                    </a:stretch>
+                  </pic:blipFill>
+                  <pic:spPr bwMode="auto">
+                    <a:xfrm>
+                      <a:off x="0" y="0"/>
+                      <a:ext cx="6400800" cy="2727279"/>
+                    </a:xfrm>
+                    <a:prstGeom prst="rect">
+                      <a:avLst/>
+                    </a:prstGeom>
+                    <a:noFill/>
+                    <a:ln w="9525">
+                      <a:noFill/>
+                      <a:headEnd/>
+                      <a:tailEnd/>
+                    </a:ln>
+                  </pic:spPr>
+                </pic:pic>
+              </a:graphicData>
+            </a:graphic>
+          </wp:inline>
+        </w:drawing>
+      </w:r>
     </w:p>
     <w:p>
       <w:pPr>
@@ -7169,8 +7127,8 @@
         <w:t xml:space="preserve">causal effect of changing a security’s liquidity.</w:t>
       </w:r>
     </w:p>
-    <w:bookmarkEnd w:id="16"/>
-    <w:bookmarkStart w:id="17" w:name="X4aa221675972b7ec0dcb3891ad85683eb60b09d"/>
+    <w:bookmarkEnd w:id="25"/>
+    <w:bookmarkStart w:id="29" w:name="X4aa221675972b7ec0dcb3891ad85683eb60b09d"/>
     <w:p>
       <w:pPr>
         <w:pStyle w:val="Heading3"/>
@@ -7195,64 +7153,50 @@
     </w:p>
     <w:p>
       <w:pPr>
-        <w:sectPr>
-          <w:type w:val="nextPage"/>
-          <w:pgSz w:w="12240" w:h="15840"/>
-          <w:pgMar w:top="1008" w:bottom="1008" w:left="1008" w:right="1008" w:header="360" w:footer="360" w:gutter="0"/>
-        </w:sectPr>
+        <w:pStyle w:val="CaptionedFigure"/>
       </w:pPr>
-    </w:p>
-    <w:tbl>
-      <w:tblPr>
-        <w:tblStyle w:val="FigureTable"/>
-        <w:tblW w:type="auto" w:w="0"/>
-        <w:jc w:val="center"/>
-        <w:tblLayout w:type="fixed"/>
-        <w:tblLook w:firstRow="0" w:lastRow="0" w:firstColumn="0" w:lastColumn="0"/>
-        <w:tblBorders>
-          <w:top w:val="single" w:sz="4" w:color="B0B0B0"/>
-          <w:left w:val="single" w:sz="4" w:color="B0B0B0"/>
-          <w:bottom w:val="single" w:sz="4" w:color="B0B0B0"/>
-          <w:right w:val="single" w:sz="4" w:color="B0B0B0"/>
-          <w:insideH w:val="single" w:sz="4" w:color="B0B0B0"/>
-          <w:insideV w:val="single" w:sz="4" w:color="B0B0B0"/>
-        </w:tblBorders>
-      </w:tblPr>
-      <w:tblGrid>
-        <w:gridCol w:w="13824"/>
-      </w:tblGrid>
-      <w:tr>
-        <w:trPr>
-          <w:tblHeader/>
-        </w:trPr>
-        <w:tc>
-          <w:tcPr>
-            <w:tcW w:type="dxa" w:w="13824"/>
-          </w:tcPr>
-          <w:p>
-            <w:pPr>
-              <w:pStyle w:val="Compact"/>
-              <w:spacing w:after="60"/>
-              <w:jc w:val="center"/>
-            </w:pPr>
-            <w:r>
-              <w:rPr>
-                <w:sz w:val="18"/>
-              </w:rPr>
-              <w:t xml:space="preserve">Figure 3. Primary MAE and RMSE by class and liquidity tier. Panel scales differ; ranks are descriptive.</w:t>
-            </w:r>
-          </w:p>
-        </w:tc>
-      </w:tr>
-    </w:tbl>
-    <w:p>
-      <w:pPr>
-        <w:sectPr>
-          <w:type w:val="nextPage"/>
-          <w:pgSz w:w="15840" w:h="12240" w:orient="landscape"/>
-          <w:pgMar w:top="1008" w:bottom="1008" w:left="1008" w:right="1008" w:header="360" w:footer="360" w:gutter="0"/>
-        </w:sectPr>
-      </w:pPr>
+      <w:r>
+        <w:drawing>
+          <wp:inline>
+            <wp:extent cx="6400800" cy="7001076"/>
+            <wp:effectExtent b="0" l="0" r="0" t="0"/>
+            <wp:docPr descr="Figure 3. Primary MAE and RMSE by class and liquidity tier. Panel scales differ; ranks are descriptive." title="" id="27" name="Picture"/>
+            <a:graphic>
+              <a:graphicData uri="http://schemas.openxmlformats.org/drawingml/2006/picture">
+                <pic:pic>
+                  <pic:nvPicPr>
+                    <pic:cNvPr descr="figure3_relative_performance.png" id="28" name="Picture"/>
+                    <pic:cNvPicPr>
+                      <a:picLocks noChangeArrowheads="1" noChangeAspect="1"/>
+                    </pic:cNvPicPr>
+                  </pic:nvPicPr>
+                  <pic:blipFill>
+                    <a:blip r:embed="rId26"/>
+                    <a:stretch>
+                      <a:fillRect/>
+                    </a:stretch>
+                  </pic:blipFill>
+                  <pic:spPr bwMode="auto">
+                    <a:xfrm>
+                      <a:off x="0" y="0"/>
+                      <a:ext cx="6400800" cy="7001076"/>
+                    </a:xfrm>
+                    <a:prstGeom prst="rect">
+                      <a:avLst/>
+                    </a:prstGeom>
+                    <a:noFill/>
+                    <a:ln w="9525">
+                      <a:noFill/>
+                      <a:headEnd/>
+                      <a:tailEnd/>
+                    </a:ln>
+                  </pic:spPr>
+                </pic:pic>
+              </a:graphicData>
+            </a:graphic>
+          </wp:inline>
+        </w:drawing>
+      </w:r>
     </w:p>
     <w:p>
       <w:pPr>
@@ -7398,8 +7342,8 @@
         <w:t xml:space="preserve">claim of stable ordering.</w:t>
       </w:r>
     </w:p>
-    <w:bookmarkEnd w:id="17"/>
-    <w:bookmarkStart w:id="18" w:name="table-2.-primary-horse-race"/>
+    <w:bookmarkEnd w:id="29"/>
+    <w:bookmarkStart w:id="30" w:name="table-2.-primary-horse-race"/>
     <w:p>
       <w:pPr>
         <w:pStyle w:val="Heading3"/>
@@ -14560,8 +14504,8 @@
         <w:t xml:space="preserve">importance.</w:t>
       </w:r>
     </w:p>
-    <w:bookmarkEnd w:id="18"/>
-    <w:bookmarkStart w:id="19" w:name="Xbe49c10834c88f4f373f4662771ff03fb376d70"/>
+    <w:bookmarkEnd w:id="30"/>
+    <w:bookmarkStart w:id="31" w:name="Xbe49c10834c88f4f373f4662771ff03fb376d70"/>
     <w:p>
       <w:pPr>
         <w:pStyle w:val="Heading3"/>
@@ -20644,9 +20588,9 @@
         <w:t xml:space="preserve">importance.</w:t>
       </w:r>
     </w:p>
-    <w:bookmarkEnd w:id="19"/>
-    <w:bookmarkEnd w:id="20"/>
-    <w:bookmarkStart w:id="22" w:name="robustness-and-falsification"/>
+    <w:bookmarkEnd w:id="31"/>
+    <w:bookmarkEnd w:id="32"/>
+    <w:bookmarkStart w:id="34" w:name="robustness-and-falsification"/>
     <w:p>
       <w:pPr>
         <w:pStyle w:val="Heading2"/>
@@ -21004,7 +20948,7 @@
         <w:t xml:space="preserve">descriptive robustness into a significance test.</w:t>
       </w:r>
     </w:p>
-    <w:bookmarkStart w:id="21" w:name="Xf66980ce603d79a9218bb3f611b566ccaca3884"/>
+    <w:bookmarkStart w:id="33" w:name="Xf66980ce603d79a9218bb3f611b566ccaca3884"/>
     <w:p>
       <w:pPr>
         <w:pStyle w:val="Heading3"/>
@@ -28452,9 +28396,9 @@
         <w:t xml:space="preserve">importance.</w:t>
       </w:r>
     </w:p>
-    <w:bookmarkEnd w:id="21"/>
-    <w:bookmarkEnd w:id="22"/>
-    <w:bookmarkStart w:id="24" w:name="cross-fitted-error-diagnostics"/>
+    <w:bookmarkEnd w:id="33"/>
+    <w:bookmarkEnd w:id="34"/>
+    <w:bookmarkStart w:id="39" w:name="cross-fitted-error-diagnostics"/>
     <w:p>
       <w:pPr>
         <w:pStyle w:val="Heading2"/>
@@ -28656,7 +28600,7 @@
         <w:t xml:space="preserve">interpretation.</w:t>
       </w:r>
     </w:p>
-    <w:bookmarkStart w:id="23" w:name="X3c226ff6f47438439594ff08494b31302976840"/>
+    <w:bookmarkStart w:id="38" w:name="X3c226ff6f47438439594ff08494b31302976840"/>
     <w:p>
       <w:pPr>
         <w:pStyle w:val="Heading3"/>
@@ -28687,64 +28631,50 @@
     </w:p>
     <w:p>
       <w:pPr>
-        <w:sectPr>
-          <w:type w:val="nextPage"/>
-          <w:pgSz w:w="12240" w:h="15840"/>
-          <w:pgMar w:top="1008" w:bottom="1008" w:left="1008" w:right="1008" w:header="360" w:footer="360" w:gutter="0"/>
-        </w:sectPr>
+        <w:pStyle w:val="CaptionedFigure"/>
       </w:pPr>
-    </w:p>
-    <w:tbl>
-      <w:tblPr>
-        <w:tblStyle w:val="FigureTable"/>
-        <w:tblW w:type="auto" w:w="0"/>
-        <w:jc w:val="center"/>
-        <w:tblLayout w:type="fixed"/>
-        <w:tblLook w:firstRow="0" w:lastRow="0" w:firstColumn="0" w:lastColumn="0"/>
-        <w:tblBorders>
-          <w:top w:val="single" w:sz="4" w:color="B0B0B0"/>
-          <w:left w:val="single" w:sz="4" w:color="B0B0B0"/>
-          <w:bottom w:val="single" w:sz="4" w:color="B0B0B0"/>
-          <w:right w:val="single" w:sz="4" w:color="B0B0B0"/>
-          <w:insideH w:val="single" w:sz="4" w:color="B0B0B0"/>
-          <w:insideV w:val="single" w:sz="4" w:color="B0B0B0"/>
-        </w:tblBorders>
-      </w:tblPr>
-      <w:tblGrid>
-        <w:gridCol w:w="13824"/>
-      </w:tblGrid>
-      <w:tr>
-        <w:trPr>
-          <w:tblHeader/>
-        </w:trPr>
-        <w:tc>
-          <w:tcPr>
-            <w:tcW w:type="dxa" w:w="13824"/>
-          </w:tcPr>
-          <w:p>
-            <w:pPr>
-              <w:pStyle w:val="Compact"/>
-              <w:spacing w:after="60"/>
-              <w:jc w:val="center"/>
-            </w:pPr>
-            <w:r>
-              <w:rPr>
-                <w:sz w:val="18"/>
-              </w:rPr>
-              <w:t xml:space="preserve">Figure 5. Secondary diagnostic: absolute-error permutation importance, mean and fold standard deviation, not confidence intervals or causal effects.</w:t>
-            </w:r>
-          </w:p>
-        </w:tc>
-      </w:tr>
-    </w:tbl>
-    <w:p>
-      <w:pPr>
-        <w:sectPr>
-          <w:type w:val="nextPage"/>
-          <w:pgSz w:w="15840" w:h="12240" w:orient="landscape"/>
-          <w:pgMar w:top="1008" w:bottom="1008" w:left="1008" w:right="1008" w:header="360" w:footer="360" w:gutter="0"/>
-        </w:sectPr>
-      </w:pPr>
+      <w:r>
+        <w:drawing>
+          <wp:inline>
+            <wp:extent cx="6400800" cy="2923002"/>
+            <wp:effectExtent b="0" l="0" r="0" t="0"/>
+            <wp:docPr descr="Figure 5. Secondary diagnostic: absolute-error permutation importance, mean and fold standard deviation, not confidence intervals or causal effects." title="" id="36" name="Picture"/>
+            <a:graphic>
+              <a:graphicData uri="http://schemas.openxmlformats.org/drawingml/2006/picture">
+                <pic:pic>
+                  <pic:nvPicPr>
+                    <pic:cNvPr descr="figure5_error_predictors.png" id="37" name="Picture"/>
+                    <pic:cNvPicPr>
+                      <a:picLocks noChangeArrowheads="1" noChangeAspect="1"/>
+                    </pic:cNvPicPr>
+                  </pic:nvPicPr>
+                  <pic:blipFill>
+                    <a:blip r:embed="rId35"/>
+                    <a:stretch>
+                      <a:fillRect/>
+                    </a:stretch>
+                  </pic:blipFill>
+                  <pic:spPr bwMode="auto">
+                    <a:xfrm>
+                      <a:off x="0" y="0"/>
+                      <a:ext cx="6400800" cy="2923002"/>
+                    </a:xfrm>
+                    <a:prstGeom prst="rect">
+                      <a:avLst/>
+                    </a:prstGeom>
+                    <a:noFill/>
+                    <a:ln w="9525">
+                      <a:noFill/>
+                      <a:headEnd/>
+                      <a:tailEnd/>
+                    </a:ln>
+                  </pic:spPr>
+                </pic:pic>
+              </a:graphicData>
+            </a:graphic>
+          </wp:inline>
+        </w:drawing>
+      </w:r>
     </w:p>
     <w:p>
       <w:pPr>
@@ -28866,9 +28796,9 @@
         <w:t xml:space="preserve">trading strategy, or a revised primary estimator ranking.</w:t>
       </w:r>
     </w:p>
-    <w:bookmarkEnd w:id="23"/>
-    <w:bookmarkEnd w:id="24"/>
-    <w:bookmarkStart w:id="25" w:name="limitations"/>
+    <w:bookmarkEnd w:id="38"/>
+    <w:bookmarkEnd w:id="39"/>
+    <w:bookmarkStart w:id="40" w:name="limitations"/>
     <w:p>
       <w:pPr>
         <w:pStyle w:val="Heading2"/>
@@ -29152,8 +29082,8 @@
         <w:t xml:space="preserve">confirmed hypotheses.</w:t>
       </w:r>
     </w:p>
-    <w:bookmarkEnd w:id="25"/>
-    <w:bookmarkStart w:id="33" w:name="conclusion"/>
+    <w:bookmarkEnd w:id="40"/>
+    <w:bookmarkStart w:id="48" w:name="conclusion"/>
     <w:p>
       <w:pPr>
         <w:pStyle w:val="Heading2"/>
@@ -29275,7 +29205,7 @@
         <w:t xml:space="preserve">of what the benchmark can and cannot measure.</w:t>
       </w:r>
     </w:p>
-    <w:bookmarkStart w:id="32" w:name="X1ed712e3038566572e228a9a4ed4d1c4e3a037e"/>
+    <w:bookmarkStart w:id="47" w:name="X1ed712e3038566572e228a9a4ed4d1c4e3a037e"/>
     <w:p>
       <w:pPr>
         <w:pStyle w:val="Heading3"/>
@@ -29317,7 +29247,7 @@
         <w:t xml:space="preserve">losses are not additive.</w:t>
       </w:r>
     </w:p>
-    <w:bookmarkStart w:id="26" w:name="asset-class-stocks"/>
+    <w:bookmarkStart w:id="41" w:name="asset-class-stocks"/>
     <w:p>
       <w:pPr>
         <w:pStyle w:val="Heading4"/>
@@ -30328,8 +30258,8 @@
         </w:sectPr>
       </w:pPr>
     </w:p>
-    <w:bookmarkEnd w:id="26"/>
-    <w:bookmarkStart w:id="27" w:name="asset-class-etfs"/>
+    <w:bookmarkEnd w:id="41"/>
+    <w:bookmarkStart w:id="42" w:name="asset-class-etfs"/>
     <w:p>
       <w:pPr>
         <w:pStyle w:val="Heading4"/>
@@ -31340,8 +31270,8 @@
         </w:sectPr>
       </w:pPr>
     </w:p>
-    <w:bookmarkEnd w:id="27"/>
-    <w:bookmarkStart w:id="28" w:name="asset-class-futures"/>
+    <w:bookmarkEnd w:id="42"/>
+    <w:bookmarkStart w:id="43" w:name="asset-class-futures"/>
     <w:p>
       <w:pPr>
         <w:pStyle w:val="Heading4"/>
@@ -32352,8 +32282,8 @@
         </w:sectPr>
       </w:pPr>
     </w:p>
-    <w:bookmarkEnd w:id="28"/>
-    <w:bookmarkStart w:id="29" w:name="asset-class-crypto"/>
+    <w:bookmarkEnd w:id="43"/>
+    <w:bookmarkStart w:id="44" w:name="asset-class-crypto"/>
     <w:p>
       <w:pPr>
         <w:pStyle w:val="Heading4"/>
@@ -33370,8 +33300,8 @@
         </w:sectPr>
       </w:pPr>
     </w:p>
-    <w:bookmarkEnd w:id="29"/>
-    <w:bookmarkStart w:id="30" w:name="asset-class-all"/>
+    <w:bookmarkEnd w:id="44"/>
+    <w:bookmarkStart w:id="45" w:name="asset-class-all"/>
     <w:p>
       <w:pPr>
         <w:pStyle w:val="Heading4"/>
@@ -34382,8 +34312,8 @@
         </w:sectPr>
       </w:pPr>
     </w:p>
-    <w:bookmarkEnd w:id="30"/>
-    <w:bookmarkStart w:id="31" w:name="asset-class-fx"/>
+    <w:bookmarkEnd w:id="45"/>
+    <w:bookmarkStart w:id="46" w:name="asset-class-fx"/>
     <w:p>
       <w:pPr>
         <w:pStyle w:val="Heading4"/>
@@ -34620,7 +34550,7 @@
         </w:sectPr>
       </w:pPr>
     </w:p>
-    <w:bookmarkEnd w:id="31"/>
+    <w:bookmarkEnd w:id="46"/>
     <w:p>
       <w:pPr>
         <w:pStyle w:val="BodyText"/>
@@ -34773,9 +34703,9 @@
         <w:t xml:space="preserve">importance.</w:t>
       </w:r>
     </w:p>
-    <w:bookmarkEnd w:id="32"/>
-    <w:bookmarkEnd w:id="33"/>
-    <w:bookmarkStart w:id="34" w:name="references"/>
+    <w:bookmarkEnd w:id="47"/>
+    <w:bookmarkEnd w:id="48"/>
+    <w:bookmarkStart w:id="49" w:name="references"/>
     <w:p>
       <w:pPr>
         <w:pStyle w:val="Heading2"/>
@@ -35057,8 +34987,8 @@
         <w:t xml:space="preserve">rather than duplicated; official FX access remained blocked.</w:t>
       </w:r>
     </w:p>
-    <w:bookmarkEnd w:id="34"/>
-    <w:bookmarkStart w:id="35" w:name="appendix-references-notes"/>
+    <w:bookmarkEnd w:id="49"/>
+    <w:bookmarkStart w:id="50" w:name="appendix-references-notes"/>
     <w:p>
       <w:pPr>
         <w:pStyle w:val="Heading2"/>
@@ -35626,8 +35556,8 @@
         <w:t xml:space="preserve">observations are not included in the public paper.</w:t>
       </w:r>
     </w:p>
-    <w:bookmarkEnd w:id="35"/>
-    <w:bookmarkEnd w:id="36"/>
+    <w:bookmarkEnd w:id="50"/>
+    <w:bookmarkEnd w:id="51"/>
     <w:sectPr>
       <w:footnotePr>
         <w:numRestart w:val="eachSect"/>

</xml_diff>